<commit_message>
docs: last sequences diagrams and updates of robustness and uc
</commit_message>
<xml_diff>
--- a/3rd_phase/Robustness-diagram-v0.2.docx
+++ b/3rd_phase/Robustness-diagram-v0.2.docx
@@ -34,7 +34,17 @@
           <w:sz w:val="48"/>
           <w:szCs w:val="48"/>
         </w:rPr>
-        <w:t>Robustness-diagram-v0.1</w:t>
+        <w:t>Robustness-diagram-v0.</w:t>
+      </w:r>
+      <w:r>
+        <w:rPr>
+          <w:rFonts w:ascii="Calibri" w:hAnsi="Calibri" w:cs="Calibri"/>
+          <w:b/>
+          <w:bCs/>
+          <w:sz w:val="48"/>
+          <w:szCs w:val="48"/>
+        </w:rPr>
+        <w:t>2</w:t>
       </w:r>
     </w:p>
     <w:p>
@@ -237,7 +247,6 @@
           <w:rFonts w:ascii="Calibri" w:hAnsi="Calibri" w:cs="Calibri"/>
           <w:sz w:val="44"/>
           <w:szCs w:val="44"/>
-          <w:lang w:val="el-GR"/>
         </w:rPr>
       </w:pPr>
       <w:r>
@@ -264,7 +273,15 @@
           <w:szCs w:val="44"/>
           <w:lang w:val="el-GR"/>
         </w:rPr>
-        <w:t>0.1</w:t>
+        <w:t>0.</w:t>
+      </w:r>
+      <w:r>
+        <w:rPr>
+          <w:rFonts w:ascii="Calibri" w:hAnsi="Calibri" w:cs="Calibri"/>
+          <w:sz w:val="44"/>
+          <w:szCs w:val="44"/>
+        </w:rPr>
+        <w:t>2</w:t>
       </w:r>
     </w:p>
     <w:p>
@@ -1347,6 +1364,7 @@
       <w:r>
         <w:rPr>
           <w:rFonts w:ascii="Calibri" w:hAnsi="Calibri" w:cs="Calibri"/>
+          <w:noProof/>
           <w:lang w:val="el-GR"/>
         </w:rPr>
         <w:drawing>
@@ -1487,6 +1505,7 @@
       <w:pPr>
         <w:rPr>
           <w:rFonts w:ascii="Calibri" w:hAnsi="Calibri" w:cs="Calibri"/>
+          <w:lang w:val="el-GR"/>
         </w:rPr>
       </w:pPr>
     </w:p>
@@ -5369,15 +5388,13 @@
       </w:pPr>
       <w:r>
         <w:rPr>
-          <w:rFonts w:ascii="Calibri" w:hAnsi="Calibri" w:cs="Calibri"/>
           <w:noProof/>
-          <w:lang w:val="el-GR"/>
         </w:rPr>
         <w:drawing>
-          <wp:inline distT="0" distB="0" distL="0" distR="0" wp14:anchorId="00C6E71C" wp14:editId="58F1FE0C">
-            <wp:extent cx="5943600" cy="5644515"/>
-            <wp:effectExtent l="0" t="0" r="0" b="0"/>
-            <wp:docPr id="895530561" name="Picture 1"/>
+          <wp:inline distT="0" distB="0" distL="0" distR="0" wp14:anchorId="41D171A0" wp14:editId="04E3C20F">
+            <wp:extent cx="5943600" cy="3844290"/>
+            <wp:effectExtent l="0" t="0" r="0" b="3810"/>
+            <wp:docPr id="1008413818" name="Picture 1"/>
             <wp:cNvGraphicFramePr>
               <a:graphicFrameLocks xmlns:a="http://schemas.openxmlformats.org/drawingml/2006/main" noChangeAspect="1"/>
             </wp:cNvGraphicFramePr>
@@ -5385,7 +5402,7 @@
               <a:graphicData uri="http://schemas.openxmlformats.org/drawingml/2006/picture">
                 <pic:pic xmlns:pic="http://schemas.openxmlformats.org/drawingml/2006/picture">
                   <pic:nvPicPr>
-                    <pic:cNvPr id="895530561" name=""/>
+                    <pic:cNvPr id="1008413818" name=""/>
                     <pic:cNvPicPr/>
                   </pic:nvPicPr>
                   <pic:blipFill>
@@ -5397,7 +5414,7 @@
                   <pic:spPr>
                     <a:xfrm>
                       <a:off x="0" y="0"/>
-                      <a:ext cx="5943600" cy="5644515"/>
+                      <a:ext cx="5943600" cy="3844290"/>
                     </a:xfrm>
                     <a:prstGeom prst="rect">
                       <a:avLst/>
@@ -5434,6 +5451,54 @@
       <w:r>
         <w:t>Project</w:t>
       </w:r>
+    </w:p>
+    <w:p>
+      <w:pPr>
+        <w:rPr>
+          <w:rFonts w:ascii="Calibri" w:hAnsi="Calibri" w:cs="Calibri"/>
+          <w:lang w:val="el-GR"/>
+        </w:rPr>
+      </w:pPr>
+    </w:p>
+    <w:p>
+      <w:pPr>
+        <w:rPr>
+          <w:rFonts w:ascii="Calibri" w:hAnsi="Calibri" w:cs="Calibri"/>
+          <w:lang w:val="el-GR"/>
+        </w:rPr>
+      </w:pPr>
+    </w:p>
+    <w:p>
+      <w:pPr>
+        <w:rPr>
+          <w:rFonts w:ascii="Calibri" w:hAnsi="Calibri" w:cs="Calibri"/>
+          <w:lang w:val="el-GR"/>
+        </w:rPr>
+      </w:pPr>
+    </w:p>
+    <w:p>
+      <w:pPr>
+        <w:rPr>
+          <w:rFonts w:ascii="Calibri" w:hAnsi="Calibri" w:cs="Calibri"/>
+          <w:lang w:val="el-GR"/>
+        </w:rPr>
+      </w:pPr>
+    </w:p>
+    <w:p>
+      <w:pPr>
+        <w:rPr>
+          <w:rFonts w:ascii="Calibri" w:hAnsi="Calibri" w:cs="Calibri"/>
+          <w:lang w:val="el-GR"/>
+        </w:rPr>
+      </w:pPr>
+    </w:p>
+    <w:p>
+      <w:pPr>
+        <w:rPr>
+          <w:rFonts w:ascii="Calibri" w:hAnsi="Calibri" w:cs="Calibri"/>
+          <w:lang w:val="el-GR"/>
+        </w:rPr>
+      </w:pPr>
     </w:p>
     <w:p>
       <w:pPr>

</xml_diff>

<commit_message>
docs: last updated docs with more details. Add new domain and updated description
</commit_message>
<xml_diff>
--- a/3rd_phase/Robustness-diagram-v0.2.docx
+++ b/3rd_phase/Robustness-diagram-v0.2.docx
@@ -247,6 +247,7 @@
           <w:rFonts w:ascii="Calibri" w:hAnsi="Calibri" w:cs="Calibri"/>
           <w:sz w:val="44"/>
           <w:szCs w:val="44"/>
+          <w:lang w:val="el-GR"/>
         </w:rPr>
       </w:pPr>
       <w:r>
@@ -280,6 +281,7 @@
           <w:rFonts w:ascii="Calibri" w:hAnsi="Calibri" w:cs="Calibri"/>
           <w:sz w:val="44"/>
           <w:szCs w:val="44"/>
+          <w:lang w:val="el-GR"/>
         </w:rPr>
         <w:t>2</w:t>
       </w:r>
@@ -1045,6 +1047,449 @@
           <w:szCs w:val="32"/>
           <w:lang w:val="el-GR"/>
         </w:rPr>
+        <w:t>Αλλαγές</w:t>
+      </w:r>
+      <w:r>
+        <w:rPr>
+          <w:rFonts w:ascii="Calibri" w:hAnsi="Calibri" w:cs="Calibri"/>
+          <w:sz w:val="32"/>
+          <w:szCs w:val="32"/>
+          <w:lang w:val="el-GR"/>
+        </w:rPr>
+        <w:t xml:space="preserve"> </w:t>
+      </w:r>
+    </w:p>
+    <w:p>
+      <w:pPr>
+        <w:rPr>
+          <w:rFonts w:ascii="Calibri" w:hAnsi="Calibri" w:cs="Calibri"/>
+          <w:lang w:val="el-GR"/>
+        </w:rPr>
+      </w:pPr>
+      <w:r>
+        <w:rPr>
+          <w:rFonts w:ascii="Calibri" w:hAnsi="Calibri" w:cs="Calibri"/>
+          <w:lang w:val="el-GR"/>
+        </w:rPr>
+        <w:t xml:space="preserve">Στην παρούσα έκδοση </w:t>
+      </w:r>
+      <w:r>
+        <w:rPr>
+          <w:rFonts w:ascii="Calibri" w:hAnsi="Calibri" w:cs="Calibri"/>
+        </w:rPr>
+        <w:t>v</w:t>
+      </w:r>
+      <w:r>
+        <w:rPr>
+          <w:rFonts w:ascii="Calibri" w:hAnsi="Calibri" w:cs="Calibri"/>
+          <w:lang w:val="el-GR"/>
+        </w:rPr>
+        <w:t>0.3 πραγματοποιήθηκαν διορθώσεις και βελτιώσεις που προέκυψαν από τη διαδικασία σχεδίασης των Διαγραμμάτων Ακολουθίας (</w:t>
+      </w:r>
+      <w:r>
+        <w:rPr>
+          <w:rFonts w:ascii="Calibri" w:hAnsi="Calibri" w:cs="Calibri"/>
+        </w:rPr>
+        <w:t>Sequence</w:t>
+      </w:r>
+      <w:r>
+        <w:rPr>
+          <w:rFonts w:ascii="Calibri" w:hAnsi="Calibri" w:cs="Calibri"/>
+          <w:lang w:val="el-GR"/>
+        </w:rPr>
+        <w:t xml:space="preserve"> </w:t>
+      </w:r>
+      <w:r>
+        <w:rPr>
+          <w:rFonts w:ascii="Calibri" w:hAnsi="Calibri" w:cs="Calibri"/>
+        </w:rPr>
+        <w:t>Diagrams</w:t>
+      </w:r>
+      <w:r>
+        <w:rPr>
+          <w:rFonts w:ascii="Calibri" w:hAnsi="Calibri" w:cs="Calibri"/>
+          <w:lang w:val="el-GR"/>
+        </w:rPr>
+        <w:t xml:space="preserve">). Συγκεκριμένα, η ανάλυση ακολουθίας ανέδειξε ασάφειες στη διατύπωση βημάτων και εναλλακτικών ροών, οι οποίες έχουν πλέον διορθωθεί. Όλες οι αλλαγές σημειώνονται με </w:t>
+      </w:r>
+      <w:r>
+        <w:rPr>
+          <w:rFonts w:ascii="Calibri" w:hAnsi="Calibri" w:cs="Calibri"/>
+          <w:lang w:val="el-GR"/>
+        </w:rPr>
+        <w:t xml:space="preserve">πορτοκαλί </w:t>
+      </w:r>
+      <w:r>
+        <w:rPr>
+          <w:rFonts w:ascii="Calibri" w:hAnsi="Calibri" w:cs="Calibri"/>
+          <w:lang w:val="el-GR"/>
+        </w:rPr>
+        <w:t xml:space="preserve">χρώμα εντός κάθε </w:t>
+      </w:r>
+      <w:r>
+        <w:rPr>
+          <w:rFonts w:ascii="Calibri" w:hAnsi="Calibri" w:cs="Calibri"/>
+          <w:lang w:val="el-GR"/>
+        </w:rPr>
+        <w:t>Διαγράμματος Ευρωστίας</w:t>
+      </w:r>
+      <w:r>
+        <w:rPr>
+          <w:rFonts w:ascii="Calibri" w:hAnsi="Calibri" w:cs="Calibri"/>
+          <w:lang w:val="el-GR"/>
+        </w:rPr>
+        <w:t>.</w:t>
+      </w:r>
+    </w:p>
+    <w:p>
+      <w:pPr>
+        <w:rPr>
+          <w:rFonts w:ascii="Calibri" w:hAnsi="Calibri" w:cs="Calibri"/>
+          <w:lang w:val="el-GR"/>
+        </w:rPr>
+      </w:pPr>
+    </w:p>
+    <w:p>
+      <w:pPr>
+        <w:rPr>
+          <w:rFonts w:ascii="Calibri" w:hAnsi="Calibri" w:cs="Calibri"/>
+          <w:lang w:val="el-GR"/>
+        </w:rPr>
+      </w:pPr>
+      <w:r>
+        <w:rPr>
+          <w:rFonts w:ascii="Calibri" w:hAnsi="Calibri" w:cs="Calibri"/>
+          <w:lang w:val="el-GR"/>
+        </w:rPr>
+        <w:t>Αναλυτικά, οι αλλαγές είναι οι ακόλουθες:</w:t>
+      </w:r>
+    </w:p>
+    <w:p>
+      <w:pPr>
+        <w:rPr>
+          <w:rFonts w:ascii="Calibri" w:hAnsi="Calibri" w:cs="Calibri"/>
+          <w:lang w:val="el-GR"/>
+        </w:rPr>
+      </w:pPr>
+      <w:r>
+        <w:rPr>
+          <w:rFonts w:ascii="Calibri" w:hAnsi="Calibri" w:cs="Calibri"/>
+          <w:b/>
+          <w:bCs/>
+        </w:rPr>
+        <w:t>RD</w:t>
+      </w:r>
+      <w:r>
+        <w:rPr>
+          <w:rFonts w:ascii="Calibri" w:hAnsi="Calibri" w:cs="Calibri"/>
+          <w:b/>
+          <w:bCs/>
+          <w:lang w:val="el-GR"/>
+        </w:rPr>
+        <w:t xml:space="preserve">01 – Δημιουργία </w:t>
+      </w:r>
+      <w:r>
+        <w:rPr>
+          <w:rFonts w:ascii="Calibri" w:hAnsi="Calibri" w:cs="Calibri"/>
+          <w:b/>
+          <w:bCs/>
+        </w:rPr>
+        <w:t>Project</w:t>
+      </w:r>
+      <w:r>
+        <w:rPr>
+          <w:rFonts w:ascii="Calibri" w:hAnsi="Calibri" w:cs="Calibri"/>
+          <w:b/>
+          <w:bCs/>
+          <w:lang w:val="el-GR"/>
+        </w:rPr>
+        <w:t>:</w:t>
+      </w:r>
+      <w:r>
+        <w:rPr>
+          <w:rFonts w:ascii="Calibri" w:hAnsi="Calibri" w:cs="Calibri"/>
+          <w:lang w:val="el-GR"/>
+        </w:rPr>
+        <w:t xml:space="preserve"> Προστέθηκε Εναλλακτική Ροή 2 (Λανθασμένο Πάτημα Κουμπιού) για να καλυφθεί η συμπεριφορά του συστήματος όταν ο χρήστης πατήσει «</w:t>
+      </w:r>
+      <w:r>
+        <w:rPr>
+          <w:rFonts w:ascii="Calibri" w:hAnsi="Calibri" w:cs="Calibri"/>
+        </w:rPr>
+        <w:t>Cancel</w:t>
+      </w:r>
+      <w:r>
+        <w:rPr>
+          <w:rFonts w:ascii="Calibri" w:hAnsi="Calibri" w:cs="Calibri"/>
+          <w:lang w:val="el-GR"/>
+        </w:rPr>
+        <w:t>» αντί για «</w:t>
+      </w:r>
+      <w:r>
+        <w:rPr>
+          <w:rFonts w:ascii="Calibri" w:hAnsi="Calibri" w:cs="Calibri"/>
+        </w:rPr>
+        <w:t>Create</w:t>
+      </w:r>
+      <w:r>
+        <w:rPr>
+          <w:rFonts w:ascii="Calibri" w:hAnsi="Calibri" w:cs="Calibri"/>
+          <w:lang w:val="el-GR"/>
+        </w:rPr>
+        <w:t xml:space="preserve">». </w:t>
+      </w:r>
+    </w:p>
+    <w:p>
+      <w:pPr>
+        <w:rPr>
+          <w:rFonts w:ascii="Calibri" w:hAnsi="Calibri" w:cs="Calibri"/>
+          <w:lang w:val="el-GR"/>
+        </w:rPr>
+      </w:pPr>
+      <w:r>
+        <w:rPr>
+          <w:rFonts w:ascii="Calibri" w:hAnsi="Calibri" w:cs="Calibri"/>
+          <w:b/>
+          <w:bCs/>
+        </w:rPr>
+        <w:t>RD</w:t>
+      </w:r>
+      <w:r>
+        <w:rPr>
+          <w:rFonts w:ascii="Calibri" w:hAnsi="Calibri" w:cs="Calibri"/>
+          <w:b/>
+          <w:bCs/>
+          <w:lang w:val="el-GR"/>
+        </w:rPr>
+        <w:t>1</w:t>
+      </w:r>
+      <w:r>
+        <w:rPr>
+          <w:rFonts w:ascii="Calibri" w:hAnsi="Calibri" w:cs="Calibri"/>
+          <w:b/>
+          <w:bCs/>
+          <w:lang w:val="el-GR"/>
+        </w:rPr>
+        <w:t xml:space="preserve">1 – </w:t>
+      </w:r>
+      <w:r>
+        <w:rPr>
+          <w:rFonts w:ascii="Calibri" w:hAnsi="Calibri" w:cs="Calibri"/>
+          <w:b/>
+          <w:bCs/>
+          <w:lang w:val="el-GR"/>
+        </w:rPr>
+        <w:t>Διαμοιρασμός</w:t>
+      </w:r>
+      <w:r>
+        <w:rPr>
+          <w:rFonts w:ascii="Calibri" w:hAnsi="Calibri" w:cs="Calibri"/>
+          <w:b/>
+          <w:bCs/>
+          <w:lang w:val="el-GR"/>
+        </w:rPr>
+        <w:t xml:space="preserve"> </w:t>
+      </w:r>
+      <w:r>
+        <w:rPr>
+          <w:rFonts w:ascii="Calibri" w:hAnsi="Calibri" w:cs="Calibri"/>
+          <w:b/>
+          <w:bCs/>
+        </w:rPr>
+        <w:t>Project</w:t>
+      </w:r>
+      <w:r>
+        <w:rPr>
+          <w:rFonts w:ascii="Calibri" w:hAnsi="Calibri" w:cs="Calibri"/>
+          <w:b/>
+          <w:bCs/>
+          <w:lang w:val="el-GR"/>
+        </w:rPr>
+        <w:t>:</w:t>
+      </w:r>
+      <w:r>
+        <w:rPr>
+          <w:rFonts w:ascii="Calibri" w:hAnsi="Calibri" w:cs="Calibri"/>
+          <w:b/>
+          <w:bCs/>
+          <w:lang w:val="el-GR"/>
+        </w:rPr>
+        <w:t xml:space="preserve"> </w:t>
+      </w:r>
+      <w:r>
+        <w:rPr>
+          <w:rFonts w:ascii="Calibri" w:hAnsi="Calibri" w:cs="Calibri"/>
+          <w:lang w:val="el-GR"/>
+        </w:rPr>
+        <w:t xml:space="preserve">Προστέθηκε η Εναλλακτική Ροή 3 (Αφαίρεση Συμμετέχοντα) για να καλυφθεί η συμπεριφορά του συστήματος όταν ο χρήστης θελήσει να αφαιρέσει ένα Συμμετέχοντα από το </w:t>
+      </w:r>
+      <w:r>
+        <w:rPr>
+          <w:rFonts w:ascii="Calibri" w:hAnsi="Calibri" w:cs="Calibri"/>
+        </w:rPr>
+        <w:t>project</w:t>
+      </w:r>
+      <w:r>
+        <w:rPr>
+          <w:rFonts w:ascii="Calibri" w:hAnsi="Calibri" w:cs="Calibri"/>
+          <w:lang w:val="el-GR"/>
+        </w:rPr>
+        <w:t>.</w:t>
+      </w:r>
+      <w:r>
+        <w:rPr>
+          <w:rFonts w:ascii="Calibri" w:hAnsi="Calibri" w:cs="Calibri"/>
+          <w:lang w:val="el-GR"/>
+        </w:rPr>
+        <w:t xml:space="preserve"> </w:t>
+      </w:r>
+    </w:p>
+    <w:p>
+      <w:pPr>
+        <w:rPr>
+          <w:rFonts w:ascii="Calibri" w:hAnsi="Calibri" w:cs="Calibri"/>
+          <w:lang w:val="el-GR"/>
+        </w:rPr>
+      </w:pPr>
+    </w:p>
+    <w:p>
+      <w:pPr>
+        <w:rPr>
+          <w:rFonts w:ascii="Calibri" w:hAnsi="Calibri" w:cs="Calibri"/>
+          <w:lang w:val="el-GR"/>
+        </w:rPr>
+      </w:pPr>
+    </w:p>
+    <w:p>
+      <w:pPr>
+        <w:rPr>
+          <w:rFonts w:ascii="Calibri" w:hAnsi="Calibri" w:cs="Calibri"/>
+          <w:lang w:val="el-GR"/>
+        </w:rPr>
+      </w:pPr>
+    </w:p>
+    <w:p>
+      <w:pPr>
+        <w:rPr>
+          <w:rFonts w:ascii="Calibri" w:hAnsi="Calibri" w:cs="Calibri"/>
+          <w:lang w:val="el-GR"/>
+        </w:rPr>
+      </w:pPr>
+    </w:p>
+    <w:p>
+      <w:pPr>
+        <w:rPr>
+          <w:rFonts w:ascii="Calibri" w:hAnsi="Calibri" w:cs="Calibri"/>
+          <w:lang w:val="el-GR"/>
+        </w:rPr>
+      </w:pPr>
+    </w:p>
+    <w:p>
+      <w:pPr>
+        <w:rPr>
+          <w:rFonts w:ascii="Calibri" w:hAnsi="Calibri" w:cs="Calibri"/>
+          <w:lang w:val="el-GR"/>
+        </w:rPr>
+      </w:pPr>
+    </w:p>
+    <w:p>
+      <w:pPr>
+        <w:rPr>
+          <w:rFonts w:ascii="Calibri" w:hAnsi="Calibri" w:cs="Calibri"/>
+          <w:lang w:val="el-GR"/>
+        </w:rPr>
+      </w:pPr>
+    </w:p>
+    <w:p>
+      <w:pPr>
+        <w:rPr>
+          <w:rFonts w:ascii="Calibri" w:hAnsi="Calibri" w:cs="Calibri"/>
+          <w:lang w:val="el-GR"/>
+        </w:rPr>
+      </w:pPr>
+    </w:p>
+    <w:p>
+      <w:pPr>
+        <w:rPr>
+          <w:rFonts w:ascii="Calibri" w:hAnsi="Calibri" w:cs="Calibri"/>
+          <w:lang w:val="el-GR"/>
+        </w:rPr>
+      </w:pPr>
+    </w:p>
+    <w:p>
+      <w:pPr>
+        <w:rPr>
+          <w:rFonts w:ascii="Calibri" w:hAnsi="Calibri" w:cs="Calibri"/>
+          <w:lang w:val="el-GR"/>
+        </w:rPr>
+      </w:pPr>
+    </w:p>
+    <w:p>
+      <w:pPr>
+        <w:rPr>
+          <w:rFonts w:ascii="Calibri" w:hAnsi="Calibri" w:cs="Calibri"/>
+          <w:lang w:val="el-GR"/>
+        </w:rPr>
+      </w:pPr>
+    </w:p>
+    <w:p>
+      <w:pPr>
+        <w:rPr>
+          <w:rFonts w:ascii="Calibri" w:hAnsi="Calibri" w:cs="Calibri"/>
+          <w:lang w:val="el-GR"/>
+        </w:rPr>
+      </w:pPr>
+    </w:p>
+    <w:p>
+      <w:pPr>
+        <w:rPr>
+          <w:rFonts w:ascii="Calibri" w:hAnsi="Calibri" w:cs="Calibri"/>
+          <w:lang w:val="el-GR"/>
+        </w:rPr>
+      </w:pPr>
+    </w:p>
+    <w:p>
+      <w:pPr>
+        <w:rPr>
+          <w:rFonts w:ascii="Calibri" w:hAnsi="Calibri" w:cs="Calibri"/>
+          <w:lang w:val="el-GR"/>
+        </w:rPr>
+      </w:pPr>
+    </w:p>
+    <w:p>
+      <w:pPr>
+        <w:rPr>
+          <w:rFonts w:ascii="Calibri" w:hAnsi="Calibri" w:cs="Calibri"/>
+          <w:lang w:val="el-GR"/>
+        </w:rPr>
+      </w:pPr>
+    </w:p>
+    <w:p>
+      <w:pPr>
+        <w:pBdr>
+          <w:top w:val="single" w:sz="4" w:space="1" w:color="auto"/>
+          <w:left w:val="single" w:sz="4" w:space="31" w:color="auto"/>
+          <w:bottom w:val="single" w:sz="4" w:space="1" w:color="auto"/>
+          <w:right w:val="single" w:sz="4" w:space="4" w:color="auto"/>
+          <w:between w:val="single" w:sz="4" w:space="1" w:color="auto"/>
+          <w:bar w:val="single" w:sz="4" w:color="auto"/>
+        </w:pBdr>
+        <w:ind w:left="360"/>
+        <w:jc w:val="center"/>
+        <w:rPr>
+          <w:rFonts w:ascii="Calibri" w:hAnsi="Calibri" w:cs="Calibri"/>
+          <w:sz w:val="32"/>
+          <w:szCs w:val="32"/>
+          <w:lang w:val="el-GR"/>
+        </w:rPr>
+      </w:pPr>
+      <w:r>
+        <w:rPr>
+          <w:rFonts w:ascii="Calibri" w:hAnsi="Calibri" w:cs="Calibri"/>
+          <w:sz w:val="32"/>
+          <w:szCs w:val="32"/>
+          <w:lang w:val="el-GR"/>
+        </w:rPr>
         <w:t>Διαγράμματα Ευρωστίας</w:t>
       </w:r>
     </w:p>
@@ -1068,7 +1513,7 @@
           <w:rFonts w:ascii="Calibri" w:hAnsi="Calibri" w:cs="Calibri"/>
           <w:lang w:val="el-GR"/>
         </w:rPr>
-        <w:t>6</w:t>
+        <w:t>5</w:t>
       </w:r>
       <w:r>
         <w:rPr>
@@ -4915,15 +5360,24 @@
           <w:bCs/>
           <w:lang w:val="el-GR"/>
         </w:rPr>
-        <w:t xml:space="preserve">Αντιγραφή παραγόμενου </w:t>
-      </w:r>
-      <w:r>
-        <w:rPr>
-          <w:rFonts w:ascii="Calibri" w:hAnsi="Calibri" w:cs="Calibri"/>
-          <w:b/>
-          <w:bCs/>
-        </w:rPr>
-        <w:t>script</w:t>
+        <w:t xml:space="preserve">Διαμοιρασμός </w:t>
+      </w:r>
+      <w:r>
+        <w:rPr>
+          <w:rFonts w:ascii="Calibri" w:hAnsi="Calibri" w:cs="Calibri"/>
+          <w:b/>
+          <w:bCs/>
+        </w:rPr>
+        <w:t>Project</w:t>
+      </w:r>
+      <w:r>
+        <w:rPr>
+          <w:rFonts w:ascii="Calibri" w:hAnsi="Calibri" w:cs="Calibri"/>
+          <w:b/>
+          <w:bCs/>
+          <w:lang w:val="el-GR"/>
+        </w:rPr>
+        <w:t xml:space="preserve"> </w:t>
       </w:r>
     </w:p>
     <w:p>
@@ -4954,381 +5408,6 @@
           <w:lang w:val="el-GR"/>
         </w:rPr>
         <w:t>1</w:t>
-      </w:r>
-      <w:r>
-        <w:rPr>
-          <w:rFonts w:ascii="Calibri" w:hAnsi="Calibri" w:cs="Calibri"/>
-          <w:lang w:val="el-GR"/>
-        </w:rPr>
-        <w:t>, παρουσιάζουμε το Διάγραμμα Ευρωστίας της Περίπτωσης Χρήσης «</w:t>
-      </w:r>
-      <w:r>
-        <w:rPr>
-          <w:rFonts w:ascii="Calibri" w:hAnsi="Calibri" w:cs="Calibri"/>
-          <w:lang w:val="el-GR"/>
-        </w:rPr>
-        <w:t>Αντιγραφή</w:t>
-      </w:r>
-      <w:r>
-        <w:rPr>
-          <w:rFonts w:ascii="Calibri" w:hAnsi="Calibri" w:cs="Calibri"/>
-          <w:lang w:val="el-GR"/>
-        </w:rPr>
-        <w:t xml:space="preserve"> </w:t>
-      </w:r>
-      <w:r>
-        <w:rPr>
-          <w:rFonts w:ascii="Calibri" w:hAnsi="Calibri" w:cs="Calibri"/>
-          <w:lang w:val="el-GR"/>
-        </w:rPr>
-        <w:t xml:space="preserve">παραγόμενου </w:t>
-      </w:r>
-      <w:r>
-        <w:rPr>
-          <w:rFonts w:ascii="Calibri" w:hAnsi="Calibri" w:cs="Calibri"/>
-        </w:rPr>
-        <w:t>script</w:t>
-      </w:r>
-      <w:r>
-        <w:rPr>
-          <w:rFonts w:ascii="Calibri" w:hAnsi="Calibri" w:cs="Calibri"/>
-          <w:lang w:val="el-GR"/>
-        </w:rPr>
-        <w:t xml:space="preserve">». Ως Χρήστη θεωρούμε και τον </w:t>
-      </w:r>
-      <w:r>
-        <w:rPr>
-          <w:rFonts w:ascii="Calibri" w:eastAsia="Arial" w:hAnsi="Calibri" w:cs="Calibri"/>
-          <w:i/>
-          <w:iCs/>
-          <w:lang w:val="el-GR"/>
-        </w:rPr>
-        <w:t>Προγραμματιστή (Ιδιοκτήτη),</w:t>
-      </w:r>
-      <w:r>
-        <w:rPr>
-          <w:rFonts w:ascii="Calibri" w:eastAsia="Arial" w:hAnsi="Calibri" w:cs="Calibri"/>
-          <w:lang w:val="el-GR"/>
-        </w:rPr>
-        <w:t xml:space="preserve"> </w:t>
-      </w:r>
-      <w:r>
-        <w:rPr>
-          <w:rFonts w:ascii="Calibri" w:eastAsia="Arial" w:hAnsi="Calibri" w:cs="Calibri"/>
-          <w:sz w:val="22"/>
-          <w:szCs w:val="22"/>
-          <w:lang w:val="el-GR"/>
-        </w:rPr>
-        <w:t xml:space="preserve">τον </w:t>
-      </w:r>
-      <w:r>
-        <w:rPr>
-          <w:rFonts w:ascii="Calibri" w:eastAsia="Arial" w:hAnsi="Calibri" w:cs="Calibri"/>
-          <w:i/>
-          <w:iCs/>
-          <w:lang w:val="el-GR"/>
-        </w:rPr>
-        <w:t>Συνεργάτη</w:t>
-      </w:r>
-      <w:r>
-        <w:rPr>
-          <w:rFonts w:ascii="Calibri" w:eastAsia="Arial" w:hAnsi="Calibri" w:cs="Calibri"/>
-          <w:lang w:val="el-GR"/>
-        </w:rPr>
-        <w:t xml:space="preserve">, τον </w:t>
-      </w:r>
-      <w:r>
-        <w:rPr>
-          <w:rFonts w:ascii="Calibri" w:eastAsia="Arial" w:hAnsi="Calibri" w:cs="Calibri"/>
-          <w:i/>
-          <w:iCs/>
-          <w:lang w:val="el-GR"/>
-        </w:rPr>
-        <w:t>Αξιολογητή</w:t>
-      </w:r>
-      <w:r>
-        <w:rPr>
-          <w:rFonts w:ascii="Calibri" w:eastAsia="Arial" w:hAnsi="Calibri" w:cs="Calibri"/>
-          <w:i/>
-          <w:iCs/>
-          <w:sz w:val="22"/>
-          <w:szCs w:val="22"/>
-          <w:lang w:val="el-GR"/>
-        </w:rPr>
-        <w:t xml:space="preserve"> </w:t>
-      </w:r>
-      <w:r>
-        <w:rPr>
-          <w:rFonts w:ascii="Calibri" w:hAnsi="Calibri" w:cs="Calibri"/>
-          <w:lang w:val="el-GR"/>
-        </w:rPr>
-        <w:t xml:space="preserve">και τον </w:t>
-      </w:r>
-      <w:r>
-        <w:rPr>
-          <w:rFonts w:ascii="Calibri" w:eastAsia="Arial" w:hAnsi="Calibri" w:cs="Calibri"/>
-          <w:i/>
-          <w:iCs/>
-          <w:lang w:val="el-GR"/>
-        </w:rPr>
-        <w:t>Ιδιοκτήτη Οργανισμού</w:t>
-      </w:r>
-      <w:r>
-        <w:rPr>
-          <w:rFonts w:ascii="Calibri" w:hAnsi="Calibri" w:cs="Calibri"/>
-          <w:lang w:val="el-GR"/>
-        </w:rPr>
-        <w:t xml:space="preserve">. Για τους σκοπούς του συγκεκριμένου διαγράμματος προσθέσαμε ως Χειριστή τον γενικό όρο </w:t>
-      </w:r>
-      <w:r>
-        <w:rPr>
-          <w:rFonts w:ascii="Calibri" w:hAnsi="Calibri" w:cs="Calibri"/>
-          <w:i/>
-          <w:iCs/>
-          <w:lang w:val="el-GR"/>
-        </w:rPr>
-        <w:t>Χρήστης</w:t>
-      </w:r>
-      <w:r>
-        <w:rPr>
-          <w:rFonts w:ascii="Calibri" w:hAnsi="Calibri" w:cs="Calibri"/>
-          <w:i/>
-          <w:iCs/>
-          <w:lang w:val="el-GR"/>
-        </w:rPr>
-        <w:t xml:space="preserve"> </w:t>
-      </w:r>
-      <w:r>
-        <w:rPr>
-          <w:rFonts w:ascii="Calibri" w:hAnsi="Calibri" w:cs="Calibri"/>
-          <w:lang w:val="el-GR"/>
-        </w:rPr>
-        <w:t>και</w:t>
-      </w:r>
-      <w:r>
-        <w:rPr>
-          <w:rFonts w:ascii="Calibri" w:hAnsi="Calibri" w:cs="Calibri"/>
-          <w:lang w:val="el-GR"/>
-        </w:rPr>
-        <w:t xml:space="preserve"> παρουσιάζουμε την οπτικοποίηση του διαγράμματος μέσω της εφαρμογής </w:t>
-      </w:r>
-      <w:r>
-        <w:rPr>
-          <w:rFonts w:ascii="Calibri" w:hAnsi="Calibri" w:cs="Calibri"/>
-        </w:rPr>
-        <w:t>plant</w:t>
-      </w:r>
-      <w:r>
-        <w:rPr>
-          <w:rFonts w:ascii="Calibri" w:hAnsi="Calibri" w:cs="Calibri"/>
-          <w:lang w:val="el-GR"/>
-        </w:rPr>
-        <w:t>-</w:t>
-      </w:r>
-      <w:r>
-        <w:rPr>
-          <w:rFonts w:ascii="Calibri" w:hAnsi="Calibri" w:cs="Calibri"/>
-        </w:rPr>
-        <w:t>uml</w:t>
-      </w:r>
-      <w:r>
-        <w:rPr>
-          <w:rFonts w:ascii="Calibri" w:hAnsi="Calibri" w:cs="Calibri"/>
-          <w:lang w:val="el-GR"/>
-        </w:rPr>
-        <w:t>.</w:t>
-      </w:r>
-    </w:p>
-    <w:p>
-      <w:pPr>
-        <w:keepNext/>
-        <w:jc w:val="center"/>
-      </w:pPr>
-      <w:r>
-        <w:rPr>
-          <w:rFonts w:ascii="Calibri" w:hAnsi="Calibri" w:cs="Calibri"/>
-          <w:noProof/>
-          <w:lang w:val="el-GR"/>
-        </w:rPr>
-        <w:drawing>
-          <wp:inline distT="0" distB="0" distL="0" distR="0" wp14:anchorId="7FB02E71" wp14:editId="5E1A83AA">
-            <wp:extent cx="5943600" cy="4500880"/>
-            <wp:effectExtent l="0" t="0" r="0" b="0"/>
-            <wp:docPr id="98226573" name="Picture 1"/>
-            <wp:cNvGraphicFramePr>
-              <a:graphicFrameLocks xmlns:a="http://schemas.openxmlformats.org/drawingml/2006/main" noChangeAspect="1"/>
-            </wp:cNvGraphicFramePr>
-            <a:graphic xmlns:a="http://schemas.openxmlformats.org/drawingml/2006/main">
-              <a:graphicData uri="http://schemas.openxmlformats.org/drawingml/2006/picture">
-                <pic:pic xmlns:pic="http://schemas.openxmlformats.org/drawingml/2006/picture">
-                  <pic:nvPicPr>
-                    <pic:cNvPr id="98226573" name=""/>
-                    <pic:cNvPicPr/>
-                  </pic:nvPicPr>
-                  <pic:blipFill>
-                    <a:blip r:embed="rId19"/>
-                    <a:stretch>
-                      <a:fillRect/>
-                    </a:stretch>
-                  </pic:blipFill>
-                  <pic:spPr>
-                    <a:xfrm>
-                      <a:off x="0" y="0"/>
-                      <a:ext cx="5943600" cy="4500880"/>
-                    </a:xfrm>
-                    <a:prstGeom prst="rect">
-                      <a:avLst/>
-                    </a:prstGeom>
-                  </pic:spPr>
-                </pic:pic>
-              </a:graphicData>
-            </a:graphic>
-          </wp:inline>
-        </w:drawing>
-      </w:r>
-    </w:p>
-    <w:p>
-      <w:pPr>
-        <w:pStyle w:val="Caption"/>
-        <w:jc w:val="center"/>
-        <w:rPr>
-          <w:rFonts w:ascii="Calibri" w:hAnsi="Calibri" w:cs="Calibri"/>
-          <w:lang w:val="el-GR"/>
-        </w:rPr>
-      </w:pPr>
-      <w:r>
-        <w:rPr>
-          <w:lang w:val="el-GR"/>
-        </w:rPr>
-        <w:t>Εικόνα 11</w:t>
-      </w:r>
-      <w:r>
-        <w:rPr>
-          <w:lang w:val="el-GR"/>
-        </w:rPr>
-        <w:t xml:space="preserve">: Αντιγραφή παραγόμενου </w:t>
-      </w:r>
-      <w:r>
-        <w:t>script</w:t>
-      </w:r>
-    </w:p>
-    <w:p>
-      <w:pPr>
-        <w:rPr>
-          <w:rFonts w:ascii="Calibri" w:hAnsi="Calibri" w:cs="Calibri"/>
-          <w:lang w:val="el-GR"/>
-        </w:rPr>
-      </w:pPr>
-    </w:p>
-    <w:p>
-      <w:pPr>
-        <w:rPr>
-          <w:rFonts w:ascii="Calibri" w:hAnsi="Calibri" w:cs="Calibri"/>
-          <w:lang w:val="el-GR"/>
-        </w:rPr>
-      </w:pPr>
-    </w:p>
-    <w:p>
-      <w:pPr>
-        <w:rPr>
-          <w:rFonts w:ascii="Calibri" w:hAnsi="Calibri" w:cs="Calibri"/>
-          <w:lang w:val="el-GR"/>
-        </w:rPr>
-      </w:pPr>
-    </w:p>
-    <w:p>
-      <w:pPr>
-        <w:rPr>
-          <w:rFonts w:ascii="Calibri" w:hAnsi="Calibri" w:cs="Calibri"/>
-          <w:lang w:val="el-GR"/>
-        </w:rPr>
-      </w:pPr>
-    </w:p>
-    <w:p>
-      <w:pPr>
-        <w:rPr>
-          <w:rFonts w:ascii="Calibri" w:hAnsi="Calibri" w:cs="Calibri"/>
-          <w:lang w:val="el-GR"/>
-        </w:rPr>
-      </w:pPr>
-    </w:p>
-    <w:p>
-      <w:pPr>
-        <w:rPr>
-          <w:rFonts w:ascii="Calibri" w:hAnsi="Calibri" w:cs="Calibri"/>
-          <w:lang w:val="el-GR"/>
-        </w:rPr>
-      </w:pPr>
-    </w:p>
-    <w:p>
-      <w:pPr>
-        <w:pBdr>
-          <w:top w:val="single" w:sz="4" w:space="1" w:color="auto"/>
-          <w:bottom w:val="single" w:sz="4" w:space="1" w:color="auto"/>
-        </w:pBdr>
-        <w:jc w:val="center"/>
-        <w:rPr>
-          <w:rFonts w:ascii="Calibri" w:hAnsi="Calibri" w:cs="Calibri"/>
-          <w:b/>
-          <w:bCs/>
-          <w:lang w:val="el-GR"/>
-        </w:rPr>
-      </w:pPr>
-      <w:r>
-        <w:rPr>
-          <w:rFonts w:ascii="Calibri" w:hAnsi="Calibri" w:cs="Calibri"/>
-          <w:b/>
-          <w:bCs/>
-          <w:lang w:val="el-GR"/>
-        </w:rPr>
-        <w:t xml:space="preserve">Διαμοιρασμός </w:t>
-      </w:r>
-      <w:r>
-        <w:rPr>
-          <w:rFonts w:ascii="Calibri" w:hAnsi="Calibri" w:cs="Calibri"/>
-          <w:b/>
-          <w:bCs/>
-        </w:rPr>
-        <w:t>Project</w:t>
-      </w:r>
-      <w:r>
-        <w:rPr>
-          <w:rFonts w:ascii="Calibri" w:hAnsi="Calibri" w:cs="Calibri"/>
-          <w:b/>
-          <w:bCs/>
-          <w:lang w:val="el-GR"/>
-        </w:rPr>
-        <w:t xml:space="preserve"> </w:t>
-      </w:r>
-    </w:p>
-    <w:p>
-      <w:pPr>
-        <w:jc w:val="both"/>
-        <w:rPr>
-          <w:rFonts w:ascii="Calibri" w:hAnsi="Calibri" w:cs="Calibri"/>
-          <w:lang w:val="el-GR"/>
-        </w:rPr>
-      </w:pPr>
-      <w:r>
-        <w:rPr>
-          <w:rFonts w:ascii="Calibri" w:hAnsi="Calibri" w:cs="Calibri"/>
-          <w:lang w:val="el-GR"/>
-        </w:rPr>
-        <w:t xml:space="preserve">Στην εικόνα </w:t>
-      </w:r>
-      <w:r>
-        <w:rPr>
-          <w:rFonts w:ascii="Calibri" w:hAnsi="Calibri" w:cs="Calibri"/>
-          <w:lang w:val="el-GR"/>
-        </w:rPr>
-        <w:t>1</w:t>
-      </w:r>
-      <w:r>
-        <w:rPr>
-          <w:rFonts w:ascii="Calibri" w:hAnsi="Calibri" w:cs="Calibri"/>
-          <w:lang w:val="el-GR"/>
-        </w:rPr>
-        <w:t>2</w:t>
       </w:r>
       <w:r>
         <w:rPr>
@@ -5406,7 +5485,7 @@
                     <pic:cNvPicPr/>
                   </pic:nvPicPr>
                   <pic:blipFill>
-                    <a:blip r:embed="rId20"/>
+                    <a:blip r:embed="rId19"/>
                     <a:stretch>
                       <a:fillRect/>
                     </a:stretch>
@@ -5440,7 +5519,13 @@
         <w:rPr>
           <w:lang w:val="el-GR"/>
         </w:rPr>
-        <w:t>Εικόνα 12</w:t>
+        <w:t>Εικόνα 1</w:t>
+      </w:r>
+      <w:r>
+        <w:rPr>
+          <w:lang w:val="el-GR"/>
+        </w:rPr>
+        <w:t>1</w:t>
       </w:r>
       <w:r>
         <w:rPr>
@@ -5583,7 +5668,7 @@
           <w:rFonts w:ascii="Calibri" w:hAnsi="Calibri" w:cs="Calibri"/>
           <w:lang w:val="el-GR"/>
         </w:rPr>
-        <w:t>3</w:t>
+        <w:t>2</w:t>
       </w:r>
       <w:r>
         <w:rPr>
@@ -5650,7 +5735,7 @@
                     <pic:cNvPicPr/>
                   </pic:nvPicPr>
                   <pic:blipFill>
-                    <a:blip r:embed="rId21"/>
+                    <a:blip r:embed="rId20"/>
                     <a:stretch>
                       <a:fillRect/>
                     </a:stretch>
@@ -5690,7 +5775,19 @@
         <w:rPr>
           <w:lang w:val="el-GR"/>
         </w:rPr>
-        <w:t>13: Διαχείριση Χρηστών</w:t>
+        <w:t>1</w:t>
+      </w:r>
+      <w:r>
+        <w:rPr>
+          <w:lang w:val="el-GR"/>
+        </w:rPr>
+        <w:t>2</w:t>
+      </w:r>
+      <w:r>
+        <w:rPr>
+          <w:lang w:val="el-GR"/>
+        </w:rPr>
+        <w:t>: Διαχείριση Χρηστών</w:t>
       </w:r>
     </w:p>
     <w:p>
@@ -5792,7 +5889,7 @@
           <w:rFonts w:ascii="Calibri" w:hAnsi="Calibri" w:cs="Calibri"/>
           <w:lang w:val="el-GR"/>
         </w:rPr>
-        <w:t>4</w:t>
+        <w:t>3</w:t>
       </w:r>
       <w:r>
         <w:rPr>
@@ -5956,7 +6053,7 @@
                     <pic:cNvPicPr/>
                   </pic:nvPicPr>
                   <pic:blipFill>
-                    <a:blip r:embed="rId22"/>
+                    <a:blip r:embed="rId21"/>
                     <a:stretch>
                       <a:fillRect/>
                     </a:stretch>
@@ -5996,7 +6093,19 @@
         <w:rPr>
           <w:lang w:val="el-GR"/>
         </w:rPr>
-        <w:t>14: Προσθήκη Σχολίου</w:t>
+        <w:t>1</w:t>
+      </w:r>
+      <w:r>
+        <w:rPr>
+          <w:lang w:val="el-GR"/>
+        </w:rPr>
+        <w:t>3</w:t>
+      </w:r>
+      <w:r>
+        <w:rPr>
+          <w:lang w:val="el-GR"/>
+        </w:rPr>
+        <w:t>: Προσθήκη Σχολίου</w:t>
       </w:r>
     </w:p>
     <w:p>
@@ -6104,7 +6213,7 @@
           <w:rFonts w:ascii="Calibri" w:hAnsi="Calibri" w:cs="Calibri"/>
           <w:lang w:val="el-GR"/>
         </w:rPr>
-        <w:t>5</w:t>
+        <w:t>4</w:t>
       </w:r>
       <w:r>
         <w:rPr>
@@ -6263,7 +6372,7 @@
                     <pic:cNvPicPr/>
                   </pic:nvPicPr>
                   <pic:blipFill>
-                    <a:blip r:embed="rId23"/>
+                    <a:blip r:embed="rId22"/>
                     <a:stretch>
                       <a:fillRect/>
                     </a:stretch>
@@ -6308,7 +6417,7 @@
         <w:rPr>
           <w:lang w:val="el-GR"/>
         </w:rPr>
-        <w:t>5</w:t>
+        <w:t>4</w:t>
       </w:r>
       <w:r>
         <w:rPr>
@@ -6473,7 +6582,7 @@
           <w:rFonts w:ascii="Calibri" w:hAnsi="Calibri" w:cs="Calibri"/>
           <w:lang w:val="el-GR"/>
         </w:rPr>
-        <w:t>6</w:t>
+        <w:t>5</w:t>
       </w:r>
       <w:r>
         <w:rPr>
@@ -6557,7 +6666,7 @@
                     <pic:cNvPicPr/>
                   </pic:nvPicPr>
                   <pic:blipFill>
-                    <a:blip r:embed="rId24"/>
+                    <a:blip r:embed="rId23"/>
                     <a:stretch>
                       <a:fillRect/>
                     </a:stretch>
@@ -6597,7 +6706,7 @@
         <w:rPr>
           <w:lang w:val="el-GR"/>
         </w:rPr>
-        <w:t>6</w:t>
+        <w:t>5</w:t>
       </w:r>
       <w:r>
         <w:rPr>
@@ -6811,7 +6920,7 @@
         </w:rPr>
         <w:t xml:space="preserve"> με τη χρήση του εργαλείου </w:t>
       </w:r>
-      <w:hyperlink r:id="rId25" w:history="1">
+      <w:hyperlink r:id="rId24" w:history="1">
         <w:r>
           <w:rPr>
             <w:rStyle w:val="Hyperlink"/>
@@ -6853,8 +6962,8 @@
       </w:pPr>
     </w:p>
     <w:sectPr>
-      <w:headerReference w:type="default" r:id="rId26"/>
-      <w:footerReference w:type="default" r:id="rId27"/>
+      <w:headerReference w:type="default" r:id="rId25"/>
+      <w:footerReference w:type="default" r:id="rId26"/>
       <w:pgSz w:w="12240" w:h="15840"/>
       <w:pgMar w:top="1440" w:right="1440" w:bottom="1440" w:left="1440" w:header="720" w:footer="720" w:gutter="0"/>
       <w:cols w:space="720"/>

</xml_diff>